<commit_message>
Update project documentation and publish fresh full-workflow evaluation reports
</commit_message>
<xml_diff>
--- a/docs/Legal_OperationsAssistant_RAG_Updated.docx
+++ b/docs/Legal_OperationsAssistant_RAG_Updated.docx
@@ -17,21 +17,7 @@
         <w:rPr>
           <w:sz w:val="46"/>
         </w:rPr>
-        <w:t xml:space="preserve"> </w:t>
-      </w:r>
-      <w:proofErr w:type="gramStart"/>
-      <w:r>
-        <w:rPr>
-          <w:sz w:val="46"/>
-        </w:rPr>
-        <w:t>( Week</w:t>
-      </w:r>
-      <w:proofErr w:type="gramEnd"/>
-      <w:r>
-        <w:rPr>
-          <w:sz w:val="46"/>
-        </w:rPr>
-        <w:t>-2)</w:t>
+        <w:t xml:space="preserve"> (Week-2)</w:t>
       </w:r>
     </w:p>
     <w:p>
@@ -415,21 +401,7 @@
               <w:rPr>
                 <w:color w:val="000000" w:themeColor="text1"/>
               </w:rPr>
-              <w:t xml:space="preserve">Employees receive cited Legal Operations guidance or Legal fallback through a </w:t>
-            </w:r>
-            <w:proofErr w:type="spellStart"/>
-            <w:r>
-              <w:rPr>
-                <w:color w:val="000000" w:themeColor="text1"/>
-              </w:rPr>
-              <w:t>Streamlit</w:t>
-            </w:r>
-            <w:proofErr w:type="spellEnd"/>
-            <w:r>
-              <w:rPr>
-                <w:color w:val="000000" w:themeColor="text1"/>
-              </w:rPr>
-              <w:t xml:space="preserve"> portal, with claim validation before display.</w:t>
+              <w:t>Employees receive cited Legal Operations guidance or a Contact Legal message through a Streamlit portal hosted on Replit, with claim validation before responses are displayed.</w:t>
             </w:r>
           </w:p>
         </w:tc>
@@ -467,13 +439,7 @@
           </w:tcPr>
           <w:p>
             <w:r>
-              <w:t>Fictional English FAQs, policies, and reviewed matter</w:t>
-            </w:r>
-            <w:r>
-              <w:t>s</w:t>
-            </w:r>
-            <w:r>
-              <w:t xml:space="preserve">. Local samples are the source of truth; </w:t>
+              <w:t>Fictional English FAQs, policies and reviewed matters: 13 JSON/PDF content files and 49 passages. Local samples supply the source text; Pinecone stores searchable vectors and metadata.</w:t>
             </w:r>
           </w:p>
         </w:tc>
@@ -510,17 +476,8 @@
             <w:hideMark/>
           </w:tcPr>
           <w:p>
-            <w:pPr>
-              <w:spacing w:after="0" w:line="240" w:lineRule="auto"/>
-              <w:rPr>
-                <w:color w:val="000000" w:themeColor="text1"/>
-              </w:rPr>
-            </w:pPr>
             <w:r>
-              <w:rPr>
-                <w:color w:val="000000" w:themeColor="text1"/>
-              </w:rPr>
-              <w:t>Read local JSON and PDF text; validate eligibility, dates, IDs, and content. Trim PDF whitespace and skip blank pages; no OCR or comprehensive cleaning.</w:t>
+              <w:t>Read JSON and text-based PDFs; validate eligibility, dates, IDs and content. Trim whitespace and skip blank pages. Scanned PDFs and advanced document cleanup are not supported.</w:t>
             </w:r>
           </w:p>
         </w:tc>
@@ -557,37 +514,8 @@
             <w:hideMark/>
           </w:tcPr>
           <w:p>
-            <w:pPr>
-              <w:spacing w:after="0" w:line="240" w:lineRule="auto"/>
-              <w:rPr>
-                <w:color w:val="000000" w:themeColor="text1"/>
-              </w:rPr>
-            </w:pPr>
             <w:r>
-              <w:rPr>
-                <w:color w:val="000000" w:themeColor="text1"/>
-              </w:rPr>
-              <w:t>Administrator manually rebuilds the index after document changes. No scheduled refresh or freshness SLA.</w:t>
-            </w:r>
-            <w:r>
-              <w:rPr>
-                <w:color w:val="000000" w:themeColor="text1"/>
-              </w:rPr>
-              <w:t xml:space="preserve"> </w:t>
-            </w:r>
-            <w:proofErr w:type="gramStart"/>
-            <w:r>
-              <w:rPr>
-                <w:color w:val="000000" w:themeColor="text1"/>
-              </w:rPr>
-              <w:t>( For</w:t>
-            </w:r>
-            <w:proofErr w:type="gramEnd"/>
-            <w:r>
-              <w:rPr>
-                <w:color w:val="000000" w:themeColor="text1"/>
-              </w:rPr>
-              <w:t xml:space="preserve"> this Prototype)</w:t>
+              <w:t>Administrator uploads a new versioned Pinecone snapshot after source changes. Startup verifies the existing snapshot and prepares a local manifest; it never uploads. No scheduled refresh or freshness SLA.</w:t>
             </w:r>
           </w:p>
         </w:tc>
@@ -681,7 +609,14 @@
               <w:rPr>
                 <w:color w:val="000000" w:themeColor="text1"/>
               </w:rPr>
-              <w:t>Chroma semantic + BM25 keyword search, up to 12 candidates each. RRF fusion and deduplication select the top four passages.</w:t>
+              <w:t xml:space="preserve">Pinecone semantic + BM25 keyword search, up to 12 candidates each. RRF fusion and </w:t>
+            </w:r>
+            <w:r>
+              <w:rPr>
+                <w:color w:val="000000" w:themeColor="text1"/>
+              </w:rPr>
+              <w:lastRenderedPageBreak/>
+              <w:t>deduplication select the top four passages.</w:t>
             </w:r>
           </w:p>
         </w:tc>
@@ -689,17 +624,22 @@
     </w:tbl>
     <w:p/>
     <w:p>
-      <w:r>
-        <w:br w:type="page"/>
-      </w:r>
-    </w:p>
-    <w:p>
       <w:pPr>
-        <w:pStyle w:val="Heading1"/>
+        <w:rPr>
+          <w:b/>
+          <w:bCs/>
+          <w:sz w:val="28"/>
+          <w:szCs w:val="28"/>
+        </w:rPr>
       </w:pPr>
       <w:bookmarkStart w:id="2" w:name="stack"/>
       <w:r>
-        <w:lastRenderedPageBreak/>
+        <w:rPr>
+          <w:b/>
+          <w:bCs/>
+          <w:sz w:val="28"/>
+          <w:szCs w:val="28"/>
+        </w:rPr>
         <w:t>3. Architecture:</w:t>
       </w:r>
     </w:p>
@@ -710,7 +650,7 @@
         </w:rPr>
         <w:drawing>
           <wp:inline distT="0" distB="0" distL="0" distR="0" wp14:anchorId="02524425" wp14:editId="02D5E597">
-            <wp:extent cx="6492240" cy="4730115"/>
+            <wp:extent cx="6492240" cy="4730060"/>
             <wp:effectExtent l="0" t="0" r="0" b="0"/>
             <wp:docPr id="1371800141" name="Picture 1"/>
             <wp:cNvGraphicFramePr>
@@ -732,7 +672,7 @@
                   <pic:spPr>
                     <a:xfrm>
                       <a:off x="0" y="0"/>
-                      <a:ext cx="6492240" cy="4730115"/>
+                      <a:ext cx="6492240" cy="4730060"/>
                     </a:xfrm>
                     <a:prstGeom prst="rect">
                       <a:avLst/>
@@ -769,7 +709,7 @@
         </w:rPr>
         <w:drawing>
           <wp:inline distT="0" distB="0" distL="0" distR="0" wp14:anchorId="512ECAD3" wp14:editId="0632F9C4">
-            <wp:extent cx="6806294" cy="4371766"/>
+            <wp:extent cx="6806294" cy="5502626"/>
             <wp:effectExtent l="0" t="0" r="1270" b="0"/>
             <wp:docPr id="1925436608" name="Picture 2"/>
             <wp:cNvGraphicFramePr>
@@ -791,7 +731,7 @@
                   <pic:spPr>
                     <a:xfrm>
                       <a:off x="0" y="0"/>
-                      <a:ext cx="6814269" cy="4376888"/>
+                      <a:ext cx="6814269" cy="5502626"/>
                     </a:xfrm>
                     <a:prstGeom prst="rect">
                       <a:avLst/>
@@ -832,7 +772,7 @@
         </w:rPr>
         <w:drawing>
           <wp:inline distT="0" distB="0" distL="0" distR="0" wp14:anchorId="6D33E34C" wp14:editId="5CAB5378">
-            <wp:extent cx="6492240" cy="6925310"/>
+            <wp:extent cx="6492240" cy="6925056"/>
             <wp:effectExtent l="0" t="0" r="0" b="0"/>
             <wp:docPr id="408621271" name="Picture 3"/>
             <wp:cNvGraphicFramePr>
@@ -854,7 +794,7 @@
                   <pic:spPr>
                     <a:xfrm>
                       <a:off x="0" y="0"/>
-                      <a:ext cx="6492240" cy="6925310"/>
+                      <a:ext cx="6492240" cy="6925056"/>
                     </a:xfrm>
                     <a:prstGeom prst="rect">
                       <a:avLst/>
@@ -1016,7 +956,7 @@
               <w:rPr>
                 <w:sz w:val="18"/>
               </w:rPr>
-              <w:t>Local MiniLM + Chroma</w:t>
+              <w:t>Local MiniLM + Pinecone</w:t>
             </w:r>
           </w:p>
         </w:tc>
@@ -1025,14 +965,8 @@
             <w:tcW w:w="3672" w:type="dxa"/>
           </w:tcPr>
           <w:p>
-            <w:pPr>
-              <w:spacing w:before="60" w:after="80"/>
-            </w:pPr>
             <w:r>
-              <w:rPr>
-                <w:sz w:val="18"/>
-              </w:rPr>
-              <w:t>Lightweight, persistent prototype without embedding API calls.</w:t>
+              <w:t>Local embeddings avoid embedding-provider calls; Pinecone provides hosted vector storage.</w:t>
             </w:r>
           </w:p>
         </w:tc>
@@ -1041,14 +975,8 @@
             <w:tcW w:w="3888" w:type="dxa"/>
           </w:tcPr>
           <w:p>
-            <w:pPr>
-              <w:spacing w:before="60" w:after="80"/>
-            </w:pPr>
             <w:r>
-              <w:rPr>
-                <w:sz w:val="18"/>
-              </w:rPr>
-              <w:t>Not established as the best model/store for the corpus.</w:t>
+              <w:t>Requires network access and Pinecone credentials; storage/query usage may incur charges. Not proven the optimal model/store for this corpus.</w:t>
             </w:r>
           </w:p>
         </w:tc>
@@ -1398,7 +1326,7 @@
     </w:p>
     <w:p>
       <w:r>
-        <w:t>Use this guide on macOS/Linux from the project folder. You need Python, a terminal, internet access for initial library/model downloads, and a Nebius API key with an accessible model and account balance. The existing environment uses Python 3.14; dependencies must support your chosen Python version.</w:t>
+        <w:t>Use this guide on macOS/Linux from the project folder. You need Python, a terminal, internet access for initial library/model downloads, and a Nebius API key with an accessible model and account balance. The existing environment uses Python 3.14; dependencies must support your chosen Python version. The build uses a virtual environment, Streamlit 1.66.1 and Pillow 13.0.0. NumPy has separate pins for Python 3.11 and Python 3.12+. Replit installation and snapshot access were confirmed by the user; the application is hosted on Replit, as reported by the project owner. The published URL and deployment type have not been recorded, and independent hosted verification has not been performed.</w:t>
       </w:r>
     </w:p>
     <w:p>
@@ -1412,23 +1340,7 @@
           <w:rFonts w:ascii="Courier New" w:hAnsi="Courier New"/>
           <w:sz w:val="18"/>
         </w:rPr>
-        <w:t>python3 -m venv .venv</w:t>
-      </w:r>
-      <w:r>
-        <w:rPr>
-          <w:rFonts w:ascii="Courier New" w:hAnsi="Courier New"/>
-          <w:sz w:val="18"/>
-        </w:rPr>
-        <w:br/>
-        <w:t>source .venv/bin/activate</w:t>
-      </w:r>
-      <w:r>
-        <w:rPr>
-          <w:rFonts w:ascii="Courier New" w:hAnsi="Courier New"/>
-          <w:sz w:val="18"/>
-        </w:rPr>
-        <w:br/>
-        <w:t>python -m pip install -r requirements.txt</w:t>
+        <w:t>python -m scripts.build_environment</w:t>
       </w:r>
     </w:p>
     <w:p>
@@ -1476,10 +1388,42 @@
         <w:br/>
         <w:t>EVIDENCE_MODEL=Qwen/Qwen3-30B-A3B-Instruct-2507</w:t>
       </w:r>
+      <w:r>
+        <w:rPr>
+          <w:rFonts w:ascii="Courier New" w:hAnsi="Courier New"/>
+          <w:sz w:val="18"/>
+        </w:rPr>
+        <w:br/>
+        <w:t>PINECONE_API_KEY=&lt;your private key&gt;</w:t>
+      </w:r>
+      <w:r>
+        <w:rPr>
+          <w:rFonts w:ascii="Courier New" w:hAnsi="Courier New"/>
+          <w:sz w:val="18"/>
+        </w:rPr>
+        <w:br/>
+        <w:t>PINECONE_INDEX_NAME=legal-operations-minilm-vectors</w:t>
+      </w:r>
+      <w:r>
+        <w:rPr>
+          <w:rFonts w:ascii="Courier New" w:hAnsi="Courier New"/>
+          <w:sz w:val="18"/>
+        </w:rPr>
+        <w:br/>
+        <w:t>PINECONE_INDEX_HOST=&lt;copy from your Pinecone index&gt;</w:t>
+      </w:r>
+      <w:r>
+        <w:rPr>
+          <w:rFonts w:ascii="Courier New" w:hAnsi="Courier New"/>
+          <w:sz w:val="18"/>
+        </w:rPr>
+        <w:br/>
+        <w:t>PINECONE_NAMESPACE=legal-demo</w:t>
+      </w:r>
     </w:p>
     <w:p>
       <w:r>
-        <w:t>Build the local search index, then launch the portal:</w:t>
+        <w:t>The 49-passage snapshot is already uploaded. Verify it and start the portal; startup does not upload vectors:</w:t>
       </w:r>
     </w:p>
     <w:p>
@@ -1488,7 +1432,7 @@
           <w:rFonts w:ascii="Courier New" w:hAnsi="Courier New"/>
           <w:sz w:val="18"/>
         </w:rPr>
-        <w:t>python knowledge_base.py</w:t>
+        <w:t>.venv/bin/python -m scripts.prepare_app</w:t>
       </w:r>
       <w:r>
         <w:rPr>
@@ -1496,12 +1440,12 @@
           <w:sz w:val="18"/>
         </w:rPr>
         <w:br/>
-        <w:t>python -m streamlit run app.py</w:t>
+        <w:t>.venv/bin/python -m scripts.start_app</w:t>
       </w:r>
     </w:p>
     <w:p>
       <w:r>
-        <w:t>Open http://localhost:8501, select Legal assistant, and submit a fictional question. Keep the terminal running. Stop the app with Ctrl+C. Indexing and search are local; grading, generation and claim validation use billed Nebius calls. The first embedding-model download may take longer.</w:t>
+        <w:t>Employees access the hosted portal through its published Replit URL (to be added). Replit Preview is for development checks; http://localhost:8501 applies only when running on your own computer. Replit runs Streamlit, LangGraph, MiniLM and BM25. Pinecone provides external vector storage/search; Nebius provides external grading, generation and claim-validation calls. Provider usage may incur charges.</w:t>
       </w:r>
     </w:p>
     <w:p>
@@ -1526,7 +1470,7 @@
           <w:sz w:val="18"/>
         </w:rPr>
         <w:br/>
-        <w:t xml:space="preserve">  app.py</w:t>
+        <w:t xml:space="preserve">  app.py                         # Portal entry point</w:t>
       </w:r>
       <w:r>
         <w:rPr>
@@ -1534,7 +1478,7 @@
           <w:sz w:val="18"/>
         </w:rPr>
         <w:br/>
-        <w:t xml:space="preserve">  app_pages/</w:t>
+        <w:t xml:space="preserve">  legal_assistant/               # Core application</w:t>
       </w:r>
       <w:r>
         <w:rPr>
@@ -1542,7 +1486,7 @@
           <w:sz w:val="18"/>
         </w:rPr>
         <w:br/>
-        <w:t xml:space="preserve">  knowledge_base.py</w:t>
+        <w:t xml:space="preserve">    app_pages/                   # Overview and chat</w:t>
       </w:r>
       <w:r>
         <w:rPr>
@@ -1550,7 +1494,7 @@
           <w:sz w:val="18"/>
         </w:rPr>
         <w:br/>
-        <w:t xml:space="preserve">  chunking.py</w:t>
+        <w:t xml:space="preserve">    knowledge_base.py            # Ingestion / Pinecone snapshots</w:t>
       </w:r>
       <w:r>
         <w:rPr>
@@ -1558,7 +1502,7 @@
           <w:sz w:val="18"/>
         </w:rPr>
         <w:br/>
-        <w:t xml:space="preserve">  retriever.py</w:t>
+        <w:t xml:space="preserve">    chunking.py                  # Section/sentence passages</w:t>
       </w:r>
       <w:r>
         <w:rPr>
@@ -1566,7 +1510,7 @@
           <w:sz w:val="18"/>
         </w:rPr>
         <w:br/>
-        <w:t xml:space="preserve">  bot.py</w:t>
+        <w:t xml:space="preserve">    embeddings.py                # Local MiniLM ONNX / tokenizer</w:t>
       </w:r>
       <w:r>
         <w:rPr>
@@ -1574,7 +1518,7 @@
           <w:sz w:val="18"/>
         </w:rPr>
         <w:br/>
-        <w:t xml:space="preserve">  workflow.py</w:t>
+        <w:t xml:space="preserve">    vector_store.py              # Pinecone connection / API adapter</w:t>
       </w:r>
       <w:r>
         <w:rPr>
@@ -1582,7 +1526,7 @@
           <w:sz w:val="18"/>
         </w:rPr>
         <w:br/>
-        <w:t xml:space="preserve">  data/</w:t>
+        <w:t xml:space="preserve">    retriever.py                 # BM25 + semantic search / fusion</w:t>
       </w:r>
       <w:r>
         <w:rPr>
@@ -1590,7 +1534,7 @@
           <w:sz w:val="18"/>
         </w:rPr>
         <w:br/>
-        <w:t xml:space="preserve">    legal_faqs/</w:t>
+        <w:t xml:space="preserve">    bot.py                       # Model calls / validation helpers</w:t>
       </w:r>
       <w:r>
         <w:rPr>
@@ -1598,7 +1542,7 @@
           <w:sz w:val="18"/>
         </w:rPr>
         <w:br/>
-        <w:t xml:space="preserve">    policies/</w:t>
+        <w:t xml:space="preserve">    workflow.py                  # LangGraph decisions</w:t>
       </w:r>
       <w:r>
         <w:rPr>
@@ -1606,7 +1550,7 @@
           <w:sz w:val="18"/>
         </w:rPr>
         <w:br/>
-        <w:t xml:space="preserve">    reviewed_matters/</w:t>
+        <w:t xml:space="preserve">  evaluation/                    # Question sets, runners and reporting</w:t>
       </w:r>
       <w:r>
         <w:rPr>
@@ -1614,7 +1558,7 @@
           <w:sz w:val="18"/>
         </w:rPr>
         <w:br/>
-        <w:t xml:space="preserve">  tests/</w:t>
+        <w:t xml:space="preserve">  scripts/                       # Build, setup, startup and packaging</w:t>
       </w:r>
       <w:r>
         <w:rPr>
@@ -1622,7 +1566,7 @@
           <w:sz w:val="18"/>
         </w:rPr>
         <w:br/>
-        <w:t xml:space="preserve">  storage/</w:t>
+        <w:t xml:space="preserve">  tests/                         # Regression checks</w:t>
       </w:r>
       <w:r>
         <w:rPr>
@@ -1630,7 +1574,7 @@
           <w:sz w:val="18"/>
         </w:rPr>
         <w:br/>
-        <w:t xml:space="preserve">    chroma/</w:t>
+        <w:t xml:space="preserve">  data/                          # Fictional FAQs, policies, matters</w:t>
       </w:r>
       <w:r>
         <w:rPr>
@@ -1638,7 +1582,7 @@
           <w:sz w:val="18"/>
         </w:rPr>
         <w:br/>
-        <w:t xml:space="preserve">    evaluations/</w:t>
+        <w:t xml:space="preserve">  storage/                       # Local manifest, model cache, reports</w:t>
       </w:r>
       <w:r>
         <w:rPr>
@@ -1646,7 +1590,7 @@
           <w:sz w:val="18"/>
         </w:rPr>
         <w:br/>
-        <w:t xml:space="preserve">  docs/</w:t>
+        <w:t xml:space="preserve">  docs/                          # Guide, diagrams and report summaries</w:t>
       </w:r>
       <w:r>
         <w:rPr>
@@ -1654,7 +1598,7 @@
           <w:sz w:val="18"/>
         </w:rPr>
         <w:br/>
-        <w:t xml:space="preserve">  .streamlit/</w:t>
+        <w:t xml:space="preserve">  .streamlit/                    # Portal theme</w:t>
       </w:r>
       <w:r>
         <w:rPr>
@@ -1662,7 +1606,7 @@
           <w:sz w:val="18"/>
         </w:rPr>
         <w:br/>
-        <w:t xml:space="preserve">  .venv/</w:t>
+        <w:t xml:space="preserve">  .replit                        # Build/run commands and port 8501</w:t>
       </w:r>
       <w:r>
         <w:rPr>
@@ -1670,7 +1614,7 @@
           <w:sz w:val="18"/>
         </w:rPr>
         <w:br/>
-        <w:t xml:space="preserve">  .env / .env.example</w:t>
+        <w:t xml:space="preserve">  requirements.txt               # Pinned dependencies</w:t>
       </w:r>
       <w:r>
         <w:rPr>
@@ -1678,7 +1622,30 @@
           <w:sz w:val="18"/>
         </w:rPr>
         <w:br/>
-        <w:t xml:space="preserve">  requirements.txt</w:t>
+      </w:r>
+      <w:r>
+        <w:rPr>
+          <w:rFonts w:ascii="Courier New" w:hAnsi="Courier New"/>
+          <w:sz w:val="18"/>
+        </w:rPr>
+        <w:lastRenderedPageBreak/>
+        <w:t xml:space="preserve">  .env / .env.example            # Private settings / safe template</w:t>
+      </w:r>
+      <w:r>
+        <w:rPr>
+          <w:rFonts w:ascii="Courier New" w:hAnsi="Courier New"/>
+          <w:sz w:val="18"/>
+        </w:rPr>
+        <w:br/>
+        <w:t xml:space="preserve">  README.md / REPLIT_SETUP.md     # Setup instructions</w:t>
+      </w:r>
+      <w:r>
+        <w:rPr>
+          <w:rFonts w:ascii="Courier New" w:hAnsi="Courier New"/>
+          <w:sz w:val="18"/>
+        </w:rPr>
+        <w:br/>
+        <w:t xml:space="preserve">  .venv/ / dist/                 # Generated; excluded from Git</w:t>
       </w:r>
     </w:p>
     <w:tbl>
@@ -1720,7 +1687,7 @@
           </w:tcPr>
           <w:p>
             <w:r>
-              <w:t>app.py / app_pages/</w:t>
+              <w:t>app.py / legal_assistant/app_pages/</w:t>
             </w:r>
           </w:p>
         </w:tc>
@@ -1742,7 +1709,7 @@
           </w:tcPr>
           <w:p>
             <w:r>
-              <w:t>knowledge_base.py</w:t>
+              <w:t>legal_assistant/knowledge_base.py</w:t>
             </w:r>
           </w:p>
         </w:tc>
@@ -1752,11 +1719,7 @@
           </w:tcPr>
           <w:p>
             <w:r>
-              <w:t xml:space="preserve">Load eligible JSON/PDF sources, attach metadata and build </w:t>
-            </w:r>
-            <w:r>
-              <w:lastRenderedPageBreak/>
-              <w:t>the index.</w:t>
+              <w:t>Load eligible JSON/PDF sources, attach metadata and build the index.</w:t>
             </w:r>
           </w:p>
         </w:tc>
@@ -1768,8 +1731,7 @@
           </w:tcPr>
           <w:p>
             <w:r>
-              <w:lastRenderedPageBreak/>
-              <w:t>chunking.py</w:t>
+              <w:t>legal_assistant/chunking.py</w:t>
             </w:r>
           </w:p>
         </w:tc>
@@ -1791,7 +1753,7 @@
           </w:tcPr>
           <w:p>
             <w:r>
-              <w:t>retriever.py</w:t>
+              <w:t>legal_assistant/retriever.py</w:t>
             </w:r>
           </w:p>
         </w:tc>
@@ -1801,7 +1763,7 @@
           </w:tcPr>
           <w:p>
             <w:r>
-              <w:t>Combine BM25 keyword and Chroma semantic results using reciprocal rank fusion.</w:t>
+              <w:t>Combine BM25 keyword and Pinecone semantic results using reciprocal rank fusion.</w:t>
             </w:r>
           </w:p>
         </w:tc>
@@ -1813,7 +1775,7 @@
           </w:tcPr>
           <w:p>
             <w:r>
-              <w:t>bot.py</w:t>
+              <w:t>legal_assistant/bot.py</w:t>
             </w:r>
           </w:p>
         </w:tc>
@@ -1835,7 +1797,7 @@
           </w:tcPr>
           <w:p>
             <w:r>
-              <w:t>workflow.py</w:t>
+              <w:t>legal_assistant/workflow.py</w:t>
             </w:r>
           </w:p>
         </w:tc>
@@ -1911,7 +1873,7 @@
           </w:tcPr>
           <w:p>
             <w:r>
-              <w:t>Active index manifest, Chroma database and saved evaluation reports.</w:t>
+              <w:t>Local active-snapshot manifest, MiniLM asset cache and saved reports. Active vectors are hosted in Pinecone.</w:t>
             </w:r>
           </w:p>
         </w:tc>
@@ -1923,7 +1885,7 @@
           </w:tcPr>
           <w:p>
             <w:r>
-              <w:t>eval_set.py / resolution_eval.py</w:t>
+              <w:t>evaluation/eval_set.py / evaluation/resolution_eval.py</w:t>
             </w:r>
           </w:p>
         </w:tc>
@@ -1945,7 +1907,7 @@
           </w:tcPr>
           <w:p>
             <w:r>
-              <w:t>scenario_eval_set.json / grouped_eval_report.py</w:t>
+              <w:t>evaluation/scenario_eval_set.json / evaluation/grouped_eval_report.py</w:t>
             </w:r>
           </w:p>
         </w:tc>
@@ -2022,6 +1984,208 @@
           <w:p>
             <w:r>
               <w:t>Private local settings and a shareable configuration template.</w:t>
+            </w:r>
+          </w:p>
+        </w:tc>
+      </w:tr>
+      <w:tr>
+        <w:tc>
+          <w:tcPr>
+            <w:tcW w:w="5112" w:type="dxa"/>
+          </w:tcPr>
+          <w:p>
+            <w:r>
+              <w:t>legal_assistant/embeddings.py</w:t>
+            </w:r>
+          </w:p>
+        </w:tc>
+        <w:tc>
+          <w:tcPr>
+            <w:tcW w:w="5112" w:type="dxa"/>
+          </w:tcPr>
+          <w:p>
+            <w:r>
+              <w:t>Load verified MiniLM ONNX assets, tokenize and create normalized 384-dimensional vectors using ONNX Runtime directly.</w:t>
+            </w:r>
+          </w:p>
+        </w:tc>
+      </w:tr>
+      <w:tr>
+        <w:tc>
+          <w:tcPr>
+            <w:tcW w:w="5112" w:type="dxa"/>
+          </w:tcPr>
+          <w:p>
+            <w:r>
+              <w:t>legal_assistant/vector_store.py</w:t>
+            </w:r>
+          </w:p>
+        </w:tc>
+        <w:tc>
+          <w:tcPr>
+            <w:tcW w:w="5112" w:type="dxa"/>
+          </w:tcPr>
+          <w:p>
+            <w:r>
+              <w:t>Validate Pinecone settings and adapt legacy vector/new document APIs. Reject hosted embedding schemas.</w:t>
+            </w:r>
+          </w:p>
+        </w:tc>
+      </w:tr>
+      <w:tr>
+        <w:tc>
+          <w:tcPr>
+            <w:tcW w:w="5112" w:type="dxa"/>
+          </w:tcPr>
+          <w:p>
+            <w:r>
+              <w:t>scripts/build_environment.py</w:t>
+            </w:r>
+          </w:p>
+        </w:tc>
+        <w:tc>
+          <w:tcPr>
+            <w:tcW w:w="5112" w:type="dxa"/>
+          </w:tcPr>
+          <w:p>
+            <w:r>
+              <w:t>Create/repair .venv, bootstrap pip, install pinned libraries and run pip check.</w:t>
+            </w:r>
+          </w:p>
+        </w:tc>
+      </w:tr>
+      <w:tr>
+        <w:tc>
+          <w:tcPr>
+            <w:tcW w:w="5112" w:type="dxa"/>
+          </w:tcPr>
+          <w:p>
+            <w:r>
+              <w:t>scripts/prepare_app.py / scripts/start_app.py</w:t>
+            </w:r>
+          </w:p>
+        </w:tc>
+        <w:tc>
+          <w:tcPr>
+            <w:tcW w:w="5112" w:type="dxa"/>
+          </w:tcPr>
+          <w:p>
+            <w:r>
+              <w:t>Verify an uploaded snapshot, recreate the local manifest and start Streamlit; no remote uploads.</w:t>
+            </w:r>
+          </w:p>
+        </w:tc>
+      </w:tr>
+      <w:tr>
+        <w:tc>
+          <w:tcPr>
+            <w:tcW w:w="5112" w:type="dxa"/>
+          </w:tcPr>
+          <w:p>
+            <w:r>
+              <w:t>scripts/create_pinecone_index.py</w:t>
+            </w:r>
+          </w:p>
+        </w:tc>
+        <w:tc>
+          <w:tcPr>
+            <w:tcW w:w="5112" w:type="dxa"/>
+          </w:tcPr>
+          <w:p>
+            <w:r>
+              <w:t>One-time compatible index creation; never part of normal startup.</w:t>
+            </w:r>
+          </w:p>
+        </w:tc>
+      </w:tr>
+      <w:tr>
+        <w:tc>
+          <w:tcPr>
+            <w:tcW w:w="5112" w:type="dxa"/>
+          </w:tcPr>
+          <w:p>
+            <w:r>
+              <w:t>scripts/package_replit.py / .replit</w:t>
+            </w:r>
+          </w:p>
+        </w:tc>
+        <w:tc>
+          <w:tcPr>
+            <w:tcW w:w="5112" w:type="dxa"/>
+          </w:tcPr>
+          <w:p>
+            <w:r>
+              <w:t>Prepare the upload ZIP and configure build/run commands and port mapping.</w:t>
+            </w:r>
+          </w:p>
+        </w:tc>
+      </w:tr>
+      <w:tr>
+        <w:tc>
+          <w:tcPr>
+            <w:tcW w:w="5112" w:type="dxa"/>
+          </w:tcPr>
+          <w:p>
+            <w:r>
+              <w:t>docs/reports/</w:t>
+            </w:r>
+          </w:p>
+        </w:tc>
+        <w:tc>
+          <w:tcPr>
+            <w:tcW w:w="5112" w:type="dxa"/>
+          </w:tcPr>
+          <w:p>
+            <w:r>
+              <w:t>Recorded Pinecone framework checks and a guide distinguishing historical answer reports.</w:t>
+            </w:r>
+          </w:p>
+        </w:tc>
+      </w:tr>
+      <w:tr>
+        <w:tc>
+          <w:tcPr>
+            <w:tcW w:w="5112" w:type="dxa"/>
+          </w:tcPr>
+          <w:p>
+            <w:r>
+              <w:t>Replit hosting</w:t>
+            </w:r>
+          </w:p>
+        </w:tc>
+        <w:tc>
+          <w:tcPr>
+            <w:tcW w:w="5112" w:type="dxa"/>
+          </w:tcPr>
+          <w:p>
+            <w:r>
+              <w:t xml:space="preserve">Runs the portal, graph, local MiniLM inference and BM25. Employees use the published URL; Preview is a </w:t>
+            </w:r>
+            <w:r>
+              <w:lastRenderedPageBreak/>
+              <w:t>development view.</w:t>
+            </w:r>
+          </w:p>
+        </w:tc>
+      </w:tr>
+      <w:tr>
+        <w:tc>
+          <w:tcPr>
+            <w:tcW w:w="5112" w:type="dxa"/>
+          </w:tcPr>
+          <w:p>
+            <w:r>
+              <w:t>Replit Secrets / Configurations</w:t>
+            </w:r>
+          </w:p>
+        </w:tc>
+        <w:tc>
+          <w:tcPr>
+            <w:tcW w:w="5112" w:type="dxa"/>
+          </w:tcPr>
+          <w:p>
+            <w:r>
+              <w:t>Hosted API keys and environment settings. Local .env is for development and is not uploaded or committed.</w:t>
             </w:r>
           </w:p>
         </w:tc>
@@ -2111,7 +2275,7 @@
           </w:tcPr>
           <w:p>
             <w:r>
-              <w:t>BM25 searches exact terms while Chroma searches meaning. Up to 12 candidates per branch are fused and deduplicated; the default final selection is four passages.</w:t>
+              <w:t>BM25 searches exact terms while Pinecone searches meaning. Up to 12 candidates per branch are fused and deduplicated; the default final selection is four passages.</w:t>
             </w:r>
           </w:p>
         </w:tc>
@@ -2221,11 +2385,7 @@
           </w:tcPr>
           <w:p>
             <w:r>
-              <w:t xml:space="preserve">Release the validated response, or show a Contact Legal </w:t>
-            </w:r>
-            <w:r>
-              <w:lastRenderedPageBreak/>
-              <w:t>fallback. A normal generated answer uses three sequential model calls.</w:t>
+              <w:t>Release the validated response, or show a Contact Legal fallback. A normal generated answer uses three sequential model calls.</w:t>
             </w:r>
           </w:p>
         </w:tc>
@@ -2233,8 +2393,7 @@
     </w:tbl>
     <w:p>
       <w:r>
-        <w:lastRenderedPageBreak/>
-        <w:t>Saved answer example from the latest evaluation (not a new live call):</w:t>
+        <w:t>Historical answer example from a saved evaluation (not a newly generated result):</w:t>
       </w:r>
     </w:p>
     <w:p>
@@ -2338,6 +2497,7 @@
           </w:tcPr>
           <w:p>
             <w:r>
+              <w:lastRenderedPageBreak/>
               <w:t>Contact Legal</w:t>
             </w:r>
           </w:p>
@@ -2408,7 +2568,7 @@
           <w:sz w:val="18"/>
         </w:rPr>
         <w:br/>
-        <w:t>.venv/bin/python eval.py</w:t>
+        <w:t>.venv/bin/python -m evaluation.eval</w:t>
       </w:r>
       <w:r>
         <w:rPr>
@@ -2416,12 +2576,12 @@
           <w:sz w:val="18"/>
         </w:rPr>
         <w:br/>
-        <w:t>.venv/bin/python eval_chunking.py</w:t>
+        <w:t>.venv/bin/python -m evaluation.eval_chunking</w:t>
       </w:r>
     </w:p>
     <w:p>
       <w:r>
-        <w:t>All 74 regression tests passed after moving the tests into tests/. The default eval.py checks 16 expected-source questions and skips four cases requiring live routing. These checks do not call Nebius; initial embedding assets may need downloading. eval_chunking.py updates its local comparison artifact.</w:t>
+        <w:t>Recorded verification: 91/91 local regression tests, 16/16 expected-source retrieval checks and 6/6 complete-evidence retrieval checks passed. A fresh 20-question full-workflow evaluation was completed on 29 October 2026 using Pinecone and Nebius. The live run includes evidence grading, generation, citation checking, claim validation and a separate automated answer-quality assessment.</w:t>
       </w:r>
     </w:p>
     <w:p>
@@ -2430,6 +2590,11 @@
       </w:r>
     </w:p>
     <w:p/>
+    <w:p>
+      <w:r>
+        <w:t>Latest full-workflow results: 29 October 2026, 16:23 PDT (23:23 UTC). Source: storage/evaluations/pinecone_full_workflow_20261029_232340/resolution_report.json. All 20 cases completed. The table below replaces the earlier figures; original historical reports are preserved separately.</w:t>
+      </w:r>
+    </w:p>
     <w:tbl>
       <w:tblPr>
         <w:tblStyle w:val="TableGrid"/>
@@ -2448,7 +2613,6 @@
           </w:tcPr>
           <w:p>
             <w:r>
-              <w:lastRenderedPageBreak/>
               <w:t>Metric</w:t>
             </w:r>
           </w:p>
@@ -2459,7 +2623,7 @@
           </w:tcPr>
           <w:p>
             <w:r>
-              <w:t>Saved result</w:t>
+              <w:t>Fresh run result</w:t>
             </w:r>
           </w:p>
         </w:tc>
@@ -2651,7 +2815,7 @@
           </w:tcPr>
           <w:p>
             <w:r>
-              <w:t>4.26 / 6.75 / 9.53 seconds</w:t>
+              <w:t>5.32 / 8.28 / 9.03 seconds</w:t>
             </w:r>
           </w:p>
         </w:tc>
@@ -2661,13 +2825,75 @@
           </w:tcPr>
           <w:p>
             <w:r>
-              <w:t>Whole workflow response time, excluding separate offline quality-evaluator calls.</w:t>
+              <w:t>Local-machine workflow timings using remote Pinecone and Nebius. Excludes the separate quality-assessment call; not a Replit latency measurement.</w:t>
             </w:r>
           </w:p>
         </w:tc>
       </w:tr>
     </w:tbl>
+    <w:p>
+      <w:r>
+        <w:t>Interpretation: 15 answerable cases met every automated guidance criterion; all four expected Legal escalations were handled, and one expected-answerable question also escalated. There were no workflow or quality-evaluator failures. Overall resolution is 75% because intentional human-escalation cases are included in the denominator.</w:t>
+      </w:r>
+    </w:p>
+    <w:p>
+      <w:r>
+        <w:t>Review case LEGAL-EVAL-15: the question combining NDA and Privacy requirements was escalated because the claim validator flagged human judgment as required, despite marking its assessed claims supported. This suggests a routing/assessment issue to review; it is not evidence of a confirmed unsupported answer. No automatic retry or code correction was performed during evaluation.</w:t>
+      </w:r>
+    </w:p>
     <w:p/>
+    <w:p>
+      <w:pPr>
+        <w:pStyle w:val="Heading1"/>
+      </w:pPr>
+      <w:r>
+        <w:lastRenderedPageBreak/>
+        <w:t>12. Pinecone indexing, startup and publishing</w:t>
+      </w:r>
+    </w:p>
+    <w:p>
+      <w:r>
+        <w:t>The existing index is legal-operations-minilm-vectors: dense vectors, 384 dimensions, cosine similarity, AWS us-east-1. MiniLM generates both document and question vectors locally. This is not Pinecone-hosted Llama inference.</w:t>
+      </w:r>
+    </w:p>
+    <w:p>
+      <w:r>
+        <w:t>An administrator runs .venv/bin/python -m legal_assistant.knowledge_base only when sources or the embedding implementation change. It uploads text, metadata and vectors to a content/model-versioned namespace, verifies visibility, then switches the local manifest. Earlier namespaces remain for rollback and may incur storage charges; they are not silently deleted.</w:t>
+      </w:r>
+    </w:p>
+    <w:p>
+      <w:r>
+        <w:t>Startup runs .venv/bin/python -m scripts.start_app. It verifies that the exact uploaded snapshot exists, rebuilds only the local manifest/BM25 corpus, and starts Streamlit on 0.0.0.0:8501. If the snapshot is missing, startup stops; it does not create an index or upload data.</w:t>
+      </w:r>
+    </w:p>
+    <w:p>
+      <w:r>
+        <w:t>Replit build command: python -m scripts.build_environment. Run command: .venv/bin/python -m scripts.start_app. Keep Pinecone and Nebius API keys in Replit Secrets, and set the index name/host/namespace plus Nebius endpoint/models for the published deployment. Use a backend deployment and confirm access, costs and Preview before Publish. Hosting is reported by the project owner. Record the published URL and actual deployment type below; this document does not claim an independent deployment test.</w:t>
+      </w:r>
+    </w:p>
+    <w:p>
+      <w:pPr>
+        <w:pStyle w:val="Heading1"/>
+      </w:pPr>
+      <w:r>
+        <w:t>13. Current checks versus earlier reports</w:t>
+      </w:r>
+    </w:p>
+    <w:p>
+      <w:r>
+        <w:t>See docs/reports/Pinecone_Framework_Checks.html for the verification summary and links to the fresh full-workflow report. The HTML, CSV and JSON outputs are in storage/evaluations/pinecone_full_workflow_20261029_232340/. Earlier saved reports remain historical baselines and were not overwritten.</w:t>
+      </w:r>
+    </w:p>
+    <w:p>
+      <w:r>
+        <w:t>The refreshed storage/chunking_comparison.json contains Pinecone retrieval checks. Its earlier baseline used a different corpus; the comparison cannot isolate the effect of chunking or the vector-store configuration.</w:t>
+      </w:r>
+    </w:p>
+    <w:p>
+      <w:r>
+        <w:t>Answer quality, resolution and response latency were assessed in the fresh live development run described in Section 11. The rubric and claim assessments are automated, not independent Legal review or user-confirmed resolution. The run was executed locally against remote services, not from the Replit-hosted application.</w:t>
+      </w:r>
+    </w:p>
     <w:sectPr>
       <w:headerReference w:type="even" r:id="rId11"/>
       <w:headerReference w:type="default" r:id="rId12"/>

</xml_diff>